<commit_message>
Updated seagrass analysis and manuscript
</commit_message>
<xml_diff>
--- a/Tables/Table_S3.docx
+++ b/Tables/Table_S3.docx
@@ -131,7 +131,7 @@
               <w:pStyle w:val="Normal"/>
             </w:pPr>
             <w:r>
-              <w:t>150 (5 ± 0.9)</w:t>
+              <w:t>154 (5 ± 0.9)</w:t>
             </w:r>
           </w:p>
         </w:tc>
@@ -503,7 +503,7 @@
               <w:pStyle w:val="Normal"/>
             </w:pPr>
             <w:r>
-              <w:t>110 (4.7 ± 0.88)</w:t>
+              <w:t>109 (4.7 ± 0.88)</w:t>
             </w:r>
           </w:p>
         </w:tc>
@@ -751,7 +751,7 @@
               <w:pStyle w:val="Normal"/>
             </w:pPr>
             <w:r>
-              <w:t>110 (4.7 ± 0.79)</w:t>
+              <w:t>108 (4.7 ± 0.79)</w:t>
             </w:r>
           </w:p>
         </w:tc>
@@ -1247,7 +1247,7 @@
               <w:pStyle w:val="Normal"/>
             </w:pPr>
             <w:r>
-              <w:t>100 (4.6 ± 0.89)</w:t>
+              <w:t>102 (4.6 ± 0.89)</w:t>
             </w:r>
           </w:p>
         </w:tc>

</xml_diff>